<commit_message>
feat: add 3200x2400 user flow diagram for customer, vendor, admin with interactive viewer
</commit_message>
<xml_diff>
--- a/docs/Panduan_Presentasi_ERD_dan_Fitur_BrightDor.docx
+++ b/docs/Panduan_Presentasi_ERD_dan_Fitur_BrightDor.docx
@@ -308,6 +308,114 @@
         </w:tc>
       </w:tr>
     </w:tbl>
+    <w:p>
+      <w:pPr>
+        <w:spacing w:before="280" w:after="120"/>
+      </w:pPr>
+      <w:r>
+        <w:rPr>
+          <w:rFonts w:ascii="Arial" w:hAnsi="Arial"/>
+          <w:b/>
+          <w:color w:val="8E1B37"/>
+          <w:sz w:val="28"/>
+        </w:rPr>
+        <w:t>2.5 PANDUAN MENJELASKAN DIAGRAM ALUR SISTEM (USER FLOW DIAGRAM)</w:t>
+      </w:r>
+    </w:p>
+    <w:p>
+      <w:r>
+        <w:t>Diagram alur sistem divisualisasikan dalam bentuk Swimlane 3 Aktor Utama (3200 x 2400 px) yang menunjukkan bagaimana aksi dari satu peran pengguna secara langsung menggerakkan alur di peran lainnya:</w:t>
+      </w:r>
+    </w:p>
+    <w:p>
+      <w:r>
+        <w:rPr>
+          <w:b/>
+        </w:rPr>
+        <w:t>Naskah Pembuka Alur Sistem:</w:t>
+        <w:br/>
+      </w:r>
+      <w:r>
+        <w:rPr>
+          <w:i/>
+          <w:color w:val="282224"/>
+        </w:rPr>
+        <w:t>"Bapak/Ibu Dosen, diagram ini merangkum proses bisnis BrightDor secara end-to-end melalui 3 jalur renang (swimlane): Jalur Merah (Couple), Jalur Emas (Vendor), dan Jalur Abu-abu (Admin). Seluruh alur saling terhubung melalui 5 titik interaksi silang."</w:t>
+      </w:r>
+    </w:p>
+    <w:p>
+      <w:pPr>
+        <w:ind w:left="288"/>
+      </w:pPr>
+      <w:r>
+        <w:rPr>
+          <w:b/>
+        </w:rPr>
+        <w:t>A. Alur Couple (7 Tahap):</w:t>
+        <w:br/>
+      </w:r>
+      <w:r>
+        <w:t>1) Eksplorasi &amp; filter vendor di beranda; 2) Registrasi akun aman (Bcrypt + self-service); 3) Evaluasi portofolio Spatie &amp; review asli; 4) Pemesanan via Booking Tanggal atau Ajukan Penawaran khusus; 5) Pembayaran transaksi (Gateway otomatis / transfer manual); 6) Pelacakan status transparan di menu 'Booking Saya'; 7) Memberikan ulasan &amp; rating bintang setelah resepsi selesai.</w:t>
+      </w:r>
+    </w:p>
+    <w:p>
+      <w:pPr>
+        <w:ind w:left="288"/>
+      </w:pPr>
+      <w:r>
+        <w:rPr>
+          <w:b/>
+        </w:rPr>
+        <w:t>B. Alur Mitra Vendor (6 Tahap):</w:t>
+        <w:br/>
+      </w:r>
+      <w:r>
+        <w:t>1) Pendaftaran mitra via form pendaftaran (1 User = 1 Vendor); 2) Unggah dokumen legalitas (KTP/NIB) ke vendor_documents; 3) Pengaturan paket jasa (services) &amp; portofolio foto; 4) Menerima notifikasi booking / permintaan penawaran harga; 5) Eksekusi layanan pernikahan saat resepsi hingga status Completed; 6) Pengajuan pencairan saldo (Payouts) ke rekening bank mitra.</w:t>
+      </w:r>
+    </w:p>
+    <w:p>
+      <w:pPr>
+        <w:ind w:left="288"/>
+      </w:pPr>
+      <w:r>
+        <w:rPr>
+          <w:b/>
+        </w:rPr>
+        <w:t>C. Alur Pengelola Admin (7 Tahap):</w:t>
+        <w:br/>
+      </w:r>
+      <w:r>
+        <w:t>1) Login aman di panel Filament dengan guard khusus; 2) Moderasi berkas legalitas &amp; sematkan badge Verified; 3) Validasi pembayaran transaksi (semi-auto webhook &amp; mutasi); 4) Pemotongan otomatis komisi platform (10%); 5) Persetujuan dan transfer pencairan dana (Payout); 6) Pengawasan operasional user tanpa campur tangan password; 7) Forensik jejak audit_logs &amp; pengelolaan materi CMS.</w:t>
+      </w:r>
+    </w:p>
+    <w:p>
+      <w:r>
+        <w:rPr>
+          <w:b/>
+        </w:rPr>
+        <w:t>5 Titik Interaksi Silang Antar-Aktor (Cross-Lane Interaction):</w:t>
+        <w:br/>
+      </w:r>
+      <w:r>
+        <w:t>1. Verifikasi Dokumen: Vendor unggah KTP/NIB → Admin menelaah &amp; verifikasi.</w:t>
+        <w:br/>
+      </w:r>
+      <w:r>
+        <w:t>2. Kirim Booking/Nego: Couple reservasi tanggal → Vendor menerima notifikasi pesanan.</w:t>
+        <w:br/>
+      </w:r>
+      <w:r>
+        <w:t>3. Validasi Pembayaran: Couple membayar → Gateway/Admin validasi status Confirmed.</w:t>
+        <w:br/>
+      </w:r>
+      <w:r>
+        <w:t>4. Transfer Payout: Vendor ajukan pencairan → Admin transfer dana bersih ke rekening.</w:t>
+        <w:br/>
+      </w:r>
+      <w:r>
+        <w:t>5. Auto-Update Rating: Couple beri ulasan → Sistem otomatis hitung ulang rating_avg vendor.</w:t>
+      </w:r>
+    </w:p>
     <w:p>
       <w:pPr>
         <w:spacing w:before="280" w:after="120"/>

</xml_diff>

<commit_message>
revert: remove technical user flow from presentation page
</commit_message>
<xml_diff>
--- a/docs/Panduan_Presentasi_ERD_dan_Fitur_BrightDor.docx
+++ b/docs/Panduan_Presentasi_ERD_dan_Fitur_BrightDor.docx
@@ -308,114 +308,6 @@
         </w:tc>
       </w:tr>
     </w:tbl>
-    <w:p>
-      <w:pPr>
-        <w:spacing w:before="280" w:after="120"/>
-      </w:pPr>
-      <w:r>
-        <w:rPr>
-          <w:rFonts w:ascii="Arial" w:hAnsi="Arial"/>
-          <w:b/>
-          <w:color w:val="8E1B37"/>
-          <w:sz w:val="28"/>
-        </w:rPr>
-        <w:t>2.5 PANDUAN MENJELASKAN DIAGRAM ALUR SISTEM (USER FLOW DIAGRAM)</w:t>
-      </w:r>
-    </w:p>
-    <w:p>
-      <w:r>
-        <w:t>Diagram alur sistem divisualisasikan dalam bentuk Swimlane 3 Aktor Utama (3200 x 2400 px) yang menunjukkan bagaimana aksi dari satu peran pengguna secara langsung menggerakkan alur di peran lainnya:</w:t>
-      </w:r>
-    </w:p>
-    <w:p>
-      <w:r>
-        <w:rPr>
-          <w:b/>
-        </w:rPr>
-        <w:t>Naskah Pembuka Alur Sistem:</w:t>
-        <w:br/>
-      </w:r>
-      <w:r>
-        <w:rPr>
-          <w:i/>
-          <w:color w:val="282224"/>
-        </w:rPr>
-        <w:t>"Bapak/Ibu Dosen, diagram ini merangkum proses bisnis BrightDor secara end-to-end melalui 3 jalur renang (swimlane): Jalur Merah (Couple), Jalur Emas (Vendor), dan Jalur Abu-abu (Admin). Seluruh alur saling terhubung melalui 5 titik interaksi silang."</w:t>
-      </w:r>
-    </w:p>
-    <w:p>
-      <w:pPr>
-        <w:ind w:left="288"/>
-      </w:pPr>
-      <w:r>
-        <w:rPr>
-          <w:b/>
-        </w:rPr>
-        <w:t>A. Alur Couple (7 Tahap):</w:t>
-        <w:br/>
-      </w:r>
-      <w:r>
-        <w:t>1) Eksplorasi &amp; filter vendor di beranda; 2) Registrasi akun aman (Bcrypt + self-service); 3) Evaluasi portofolio Spatie &amp; review asli; 4) Pemesanan via Booking Tanggal atau Ajukan Penawaran khusus; 5) Pembayaran transaksi (Gateway otomatis / transfer manual); 6) Pelacakan status transparan di menu 'Booking Saya'; 7) Memberikan ulasan &amp; rating bintang setelah resepsi selesai.</w:t>
-      </w:r>
-    </w:p>
-    <w:p>
-      <w:pPr>
-        <w:ind w:left="288"/>
-      </w:pPr>
-      <w:r>
-        <w:rPr>
-          <w:b/>
-        </w:rPr>
-        <w:t>B. Alur Mitra Vendor (6 Tahap):</w:t>
-        <w:br/>
-      </w:r>
-      <w:r>
-        <w:t>1) Pendaftaran mitra via form pendaftaran (1 User = 1 Vendor); 2) Unggah dokumen legalitas (KTP/NIB) ke vendor_documents; 3) Pengaturan paket jasa (services) &amp; portofolio foto; 4) Menerima notifikasi booking / permintaan penawaran harga; 5) Eksekusi layanan pernikahan saat resepsi hingga status Completed; 6) Pengajuan pencairan saldo (Payouts) ke rekening bank mitra.</w:t>
-      </w:r>
-    </w:p>
-    <w:p>
-      <w:pPr>
-        <w:ind w:left="288"/>
-      </w:pPr>
-      <w:r>
-        <w:rPr>
-          <w:b/>
-        </w:rPr>
-        <w:t>C. Alur Pengelola Admin (7 Tahap):</w:t>
-        <w:br/>
-      </w:r>
-      <w:r>
-        <w:t>1) Login aman di panel Filament dengan guard khusus; 2) Moderasi berkas legalitas &amp; sematkan badge Verified; 3) Validasi pembayaran transaksi (semi-auto webhook &amp; mutasi); 4) Pemotongan otomatis komisi platform (10%); 5) Persetujuan dan transfer pencairan dana (Payout); 6) Pengawasan operasional user tanpa campur tangan password; 7) Forensik jejak audit_logs &amp; pengelolaan materi CMS.</w:t>
-      </w:r>
-    </w:p>
-    <w:p>
-      <w:r>
-        <w:rPr>
-          <w:b/>
-        </w:rPr>
-        <w:t>5 Titik Interaksi Silang Antar-Aktor (Cross-Lane Interaction):</w:t>
-        <w:br/>
-      </w:r>
-      <w:r>
-        <w:t>1. Verifikasi Dokumen: Vendor unggah KTP/NIB → Admin menelaah &amp; verifikasi.</w:t>
-        <w:br/>
-      </w:r>
-      <w:r>
-        <w:t>2. Kirim Booking/Nego: Couple reservasi tanggal → Vendor menerima notifikasi pesanan.</w:t>
-        <w:br/>
-      </w:r>
-      <w:r>
-        <w:t>3. Validasi Pembayaran: Couple membayar → Gateway/Admin validasi status Confirmed.</w:t>
-        <w:br/>
-      </w:r>
-      <w:r>
-        <w:t>4. Transfer Payout: Vendor ajukan pencairan → Admin transfer dana bersih ke rekening.</w:t>
-        <w:br/>
-      </w:r>
-      <w:r>
-        <w:t>5. Auto-Update Rating: Couple beri ulasan → Sistem otomatis hitung ulang rating_avg vendor.</w:t>
-      </w:r>
-    </w:p>
     <w:p>
       <w:pPr>
         <w:spacing w:before="280" w:after="120"/>

</xml_diff>